<commit_message>
Update resume (docx and pdf)
</commit_message>
<xml_diff>
--- a/Resume.docx
+++ b/Resume.docx
@@ -126,12 +126,6 @@
         <w:gridCol w:w="840"/>
       </w:tblGrid>
       <w:tr>
-        <w:tblPrEx>
-          <w:tblCellMar>
-            <w:top w:w="0" w:type="dxa"/>
-            <w:bottom w:w="0" w:type="dxa"/>
-          </w:tblCellMar>
-        </w:tblPrEx>
         <w:tc>
           <w:tcPr>
             <w:tcW w:w="1250" w:type="pct"/>
@@ -226,12 +220,6 @@
         </w:tc>
       </w:tr>
       <w:tr>
-        <w:tblPrEx>
-          <w:tblCellMar>
-            <w:top w:w="0" w:type="dxa"/>
-            <w:bottom w:w="0" w:type="dxa"/>
-          </w:tblCellMar>
-        </w:tblPrEx>
         <w:tc>
           <w:tcPr>
             <w:tcW w:w="1600" w:type="pct"/>
@@ -314,12 +302,6 @@
         </w:tc>
       </w:tr>
       <w:tr>
-        <w:tblPrEx>
-          <w:tblCellMar>
-            <w:top w:w="0" w:type="dxa"/>
-            <w:bottom w:w="0" w:type="dxa"/>
-          </w:tblCellMar>
-        </w:tblPrEx>
         <w:tc>
           <w:tcPr>
             <w:tcW w:w="1600" w:type="pct"/>
@@ -839,7 +821,7 @@
           <w:sz w:val="20"/>
           <w:szCs w:val="20"/>
         </w:rPr>
-        <w:t xml:space="preserve">  —  15 Days — [Add Month/Year]</w:t>
+        <w:t xml:space="preserve">  —  15 Days </w:t>
       </w:r>
     </w:p>
     <w:p>
@@ -1182,7 +1164,13 @@
     </w:p>
     <w:p>
       <w:r>
-        <w:t>Place: Madurai, Tamil Nadu</w:t>
+        <w:tab/>
+      </w:r>
+      <w:r>
+        <w:tab/>
+      </w:r>
+      <w:r>
+        <w:tab/>
       </w:r>
       <w:r>
         <w:tab/>

</xml_diff>

<commit_message>
Update: Refresh latest resume files (PDF and DOCX) on GitHub
</commit_message>
<xml_diff>
--- a/Resume.docx
+++ b/Resume.docx
@@ -276,7 +276,35 @@
                 <w:sz w:val="21"/>
                 <w:szCs w:val="21"/>
               </w:rPr>
-              <w:t>CGPA: 7.75/10 (up to Semester 5)</w:t>
+              <w:t>CGPA: 7.</w:t>
+            </w:r>
+            <w:r>
+              <w:rPr>
+                <w:sz w:val="21"/>
+                <w:szCs w:val="21"/>
+              </w:rPr>
+              <w:t>8</w:t>
+            </w:r>
+            <w:r>
+              <w:rPr>
+                <w:sz w:val="21"/>
+                <w:szCs w:val="21"/>
+              </w:rPr>
+              <w:t xml:space="preserve">5/10 (up to Semester </w:t>
+            </w:r>
+            <w:r>
+              <w:rPr>
+                <w:sz w:val="21"/>
+                <w:szCs w:val="21"/>
+              </w:rPr>
+              <w:t>6</w:t>
+            </w:r>
+            <w:r>
+              <w:rPr>
+                <w:sz w:val="21"/>
+                <w:szCs w:val="21"/>
+              </w:rPr>
+              <w:t>)</w:t>
             </w:r>
           </w:p>
         </w:tc>
@@ -476,15 +504,7 @@
         <w:spacing w:after="40"/>
       </w:pPr>
       <w:r>
-        <w:t xml:space="preserve">3D &amp; Media Tools: Blender (3D </w:t>
-      </w:r>
-      <w:proofErr w:type="spellStart"/>
-      <w:r>
-        <w:t>Modeling</w:t>
-      </w:r>
-      <w:proofErr w:type="spellEnd"/>
-      <w:r>
-        <w:t xml:space="preserve"> &amp; Rendering), DaVinci Resolve (Video Production)</w:t>
+        <w:t>3D &amp; Media Tools: Blender (3D Modeling &amp; Rendering), DaVinci Resolve (Video Production)</w:t>
       </w:r>
     </w:p>
     <w:p>
@@ -998,15 +1018,7 @@
         <w:spacing w:after="40"/>
       </w:pPr>
       <w:r>
-        <w:t>CNC Programming Training (G-Code/M-Code), NTTF (</w:t>
-      </w:r>
-      <w:proofErr w:type="spellStart"/>
-      <w:r>
-        <w:t>Nettur</w:t>
-      </w:r>
-      <w:proofErr w:type="spellEnd"/>
-      <w:r>
-        <w:t xml:space="preserve"> Technical Training Foundation), Bangalore</w:t>
+        <w:t>CNC Programming Training (G-Code/M-Code), NTTF (Nettur Technical Training Foundation), Bangalore</w:t>
       </w:r>
     </w:p>
     <w:p>
@@ -1159,39 +1171,9 @@
       </w:r>
       <w:r>
         <w:tab/>
-        <w:t>_____________________</w:t>
-      </w:r>
-    </w:p>
-    <w:p>
-      <w:r>
-        <w:tab/>
-      </w:r>
-      <w:r>
-        <w:tab/>
-      </w:r>
-      <w:r>
-        <w:tab/>
-      </w:r>
-      <w:r>
-        <w:tab/>
-      </w:r>
-      <w:r>
-        <w:tab/>
-      </w:r>
-      <w:r>
-        <w:tab/>
-      </w:r>
-      <w:r>
-        <w:tab/>
-      </w:r>
-      <w:r>
-        <w:t xml:space="preserve">                             </w:t>
-      </w:r>
-      <w:r>
-        <w:tab/>
-        <w:t>(Signature)</w:t>
-      </w:r>
-    </w:p>
+      </w:r>
+    </w:p>
+    <w:p/>
     <w:sectPr>
       <w:pgSz w:w="11906" w:h="16838"/>
       <w:pgMar w:top="560" w:right="700" w:bottom="560" w:left="700" w:header="708" w:footer="708" w:gutter="0"/>

</xml_diff>

<commit_message>
Update: Replace Resume.pdf with latest Resume_s.pdf and sync all resume files
</commit_message>
<xml_diff>
--- a/Resume.docx
+++ b/Resume.docx
@@ -831,7 +831,43 @@
           <w:sz w:val="24"/>
           <w:szCs w:val="24"/>
         </w:rPr>
-        <w:t>Paint Shop Department Internship</w:t>
+        <w:t>schwing stetter india pvt ltd</w:t>
+      </w:r>
+      <w:r>
+        <w:rPr>
+          <w:b/>
+          <w:bCs/>
+          <w:sz w:val="24"/>
+          <w:szCs w:val="24"/>
+        </w:rPr>
+        <w:t xml:space="preserve"> (</w:t>
+      </w:r>
+      <w:r>
+        <w:rPr>
+          <w:b/>
+          <w:bCs/>
+          <w:sz w:val="24"/>
+          <w:szCs w:val="24"/>
+        </w:rPr>
+        <w:t>Paint Shop Department</w:t>
+      </w:r>
+      <w:r>
+        <w:rPr>
+          <w:b/>
+          <w:bCs/>
+          <w:sz w:val="24"/>
+          <w:szCs w:val="24"/>
+        </w:rPr>
+        <w:t xml:space="preserve">) </w:t>
+      </w:r>
+      <w:r>
+        <w:rPr>
+          <w:b/>
+          <w:bCs/>
+          <w:sz w:val="24"/>
+          <w:szCs w:val="24"/>
+        </w:rPr>
+        <w:t>Internship</w:t>
       </w:r>
       <w:r>
         <w:rPr>
@@ -923,7 +959,35 @@
         <w:spacing w:after="40"/>
       </w:pPr>
       <w:r>
-        <w:t>3rd Prize — SkyForge Event, Euphoria Techno Management Meet, Kalasalingam Academy of Research &amp; Education (Mar 2026)</w:t>
+        <w:t>3rd Prize — SkyForge Event, Euphoria Techno Management Meet, Kalasalingam Academy of Research &amp; Education (Mar 202</w:t>
+      </w:r>
+      <w:r>
+        <w:t>5</w:t>
+      </w:r>
+      <w:r>
+        <w:t>)</w:t>
+      </w:r>
+    </w:p>
+    <w:p>
+      <w:pPr>
+        <w:pStyle w:val="ListParagraph"/>
+        <w:numPr>
+          <w:ilvl w:val="0"/>
+          <w:numId w:val="2"/>
+        </w:numPr>
+        <w:spacing w:after="40"/>
+      </w:pPr>
+      <w:r>
+        <w:t>2</w:t>
+      </w:r>
+      <w:r>
+        <w:t>rd Prize — SkyForge Event, Euphoria Techno Management Meet, Kalasalingam Academy of Research &amp; Education (Mar 202</w:t>
+      </w:r>
+      <w:r>
+        <w:t>6</w:t>
+      </w:r>
+      <w:r>
+        <w:t>)</w:t>
       </w:r>
     </w:p>
     <w:p>
@@ -1173,7 +1237,6 @@
         <w:tab/>
       </w:r>
     </w:p>
-    <w:p/>
     <w:sectPr>
       <w:pgSz w:w="11906" w:h="16838"/>
       <w:pgMar w:top="560" w:right="700" w:bottom="560" w:left="700" w:header="708" w:footer="708" w:gutter="0"/>

</xml_diff>

<commit_message>
Update latest soft resume (Resume_soft.pdf and Resume.pdf) and add portfolio section screenshots
</commit_message>
<xml_diff>
--- a/Resume.docx
+++ b/Resume.docx
@@ -840,34 +840,7 @@
           <w:sz w:val="24"/>
           <w:szCs w:val="24"/>
         </w:rPr>
-        <w:t xml:space="preserve"> (</w:t>
-      </w:r>
-      <w:r>
-        <w:rPr>
-          <w:b/>
-          <w:bCs/>
-          <w:sz w:val="24"/>
-          <w:szCs w:val="24"/>
-        </w:rPr>
-        <w:t>Paint Shop Department</w:t>
-      </w:r>
-      <w:r>
-        <w:rPr>
-          <w:b/>
-          <w:bCs/>
-          <w:sz w:val="24"/>
-          <w:szCs w:val="24"/>
-        </w:rPr>
-        <w:t xml:space="preserve">) </w:t>
-      </w:r>
-      <w:r>
-        <w:rPr>
-          <w:b/>
-          <w:bCs/>
-          <w:sz w:val="24"/>
-          <w:szCs w:val="24"/>
-        </w:rPr>
-        <w:t>Internship</w:t>
+        <w:t xml:space="preserve"> (Paint Shop Department) Internship</w:t>
       </w:r>
       <w:r>
         <w:rPr>
@@ -946,7 +919,13 @@
         <w:spacing w:after="40"/>
       </w:pPr>
       <w:r>
-        <w:t>2nd Prize — Technical Quiz, Yuvasakthi 2K26 National Level Technical Symposium, NPR College of Engineering &amp; Technology, Natham (Mar 2026)</w:t>
+        <w:t>2nd Prize — Technical Quiz, Yuvasakthi 2K26 National Level Technical Symposium, NPR College of Engineering &amp; Technology, Natham (Mar 202</w:t>
+      </w:r>
+      <w:r>
+        <w:t>5</w:t>
+      </w:r>
+      <w:r>
+        <w:t>)</w:t>
       </w:r>
     </w:p>
     <w:p>
@@ -978,16 +957,7 @@
         <w:spacing w:after="40"/>
       </w:pPr>
       <w:r>
-        <w:t>2</w:t>
-      </w:r>
-      <w:r>
-        <w:t>rd Prize — SkyForge Event, Euphoria Techno Management Meet, Kalasalingam Academy of Research &amp; Education (Mar 202</w:t>
-      </w:r>
-      <w:r>
-        <w:t>6</w:t>
-      </w:r>
-      <w:r>
-        <w:t>)</w:t>
+        <w:t>2rd Prize — SkyForge Event, Euphoria Techno Management Meet, Kalasalingam Academy of Research &amp; Education (Mar 2026)</w:t>
       </w:r>
     </w:p>
     <w:p>

</xml_diff>

<commit_message>
Update Resume soft (PDF & DOCX) and synchronize portfolio download links
</commit_message>
<xml_diff>
--- a/Resume.docx
+++ b/Resume.docx
@@ -283,14 +283,14 @@
                 <w:sz w:val="21"/>
                 <w:szCs w:val="21"/>
               </w:rPr>
-              <w:t>8</w:t>
+              <w:t>76</w:t>
             </w:r>
             <w:r>
               <w:rPr>
                 <w:sz w:val="21"/>
                 <w:szCs w:val="21"/>
               </w:rPr>
-              <w:t xml:space="preserve">5/10 (up to Semester </w:t>
+              <w:t xml:space="preserve">/10 (up to Semester </w:t>
             </w:r>
             <w:r>
               <w:rPr>
@@ -504,7 +504,15 @@
         <w:spacing w:after="40"/>
       </w:pPr>
       <w:r>
-        <w:t>3D &amp; Media Tools: Blender (3D Modeling &amp; Rendering), DaVinci Resolve (Video Production)</w:t>
+        <w:t xml:space="preserve">3D &amp; Media Tools: Blender (3D </w:t>
+      </w:r>
+      <w:proofErr w:type="spellStart"/>
+      <w:r>
+        <w:t>Modeling</w:t>
+      </w:r>
+      <w:proofErr w:type="spellEnd"/>
+      <w:r>
+        <w:t xml:space="preserve"> &amp; Rendering), DaVinci Resolve (Video Production)</w:t>
       </w:r>
     </w:p>
     <w:p>
@@ -831,7 +839,52 @@
           <w:sz w:val="24"/>
           <w:szCs w:val="24"/>
         </w:rPr>
-        <w:t>schwing stetter india pvt ltd</w:t>
+        <w:t>Schwing</w:t>
+      </w:r>
+      <w:r>
+        <w:rPr>
+          <w:b/>
+          <w:bCs/>
+          <w:sz w:val="24"/>
+          <w:szCs w:val="24"/>
+        </w:rPr>
+        <w:t xml:space="preserve"> </w:t>
+      </w:r>
+      <w:r>
+        <w:rPr>
+          <w:b/>
+          <w:bCs/>
+          <w:sz w:val="24"/>
+          <w:szCs w:val="24"/>
+        </w:rPr>
+        <w:t>Stetter</w:t>
+      </w:r>
+      <w:r>
+        <w:rPr>
+          <w:b/>
+          <w:bCs/>
+          <w:sz w:val="24"/>
+          <w:szCs w:val="24"/>
+        </w:rPr>
+        <w:t xml:space="preserve"> </w:t>
+      </w:r>
+      <w:r>
+        <w:rPr>
+          <w:b/>
+          <w:bCs/>
+          <w:sz w:val="24"/>
+          <w:szCs w:val="24"/>
+        </w:rPr>
+        <w:t>India</w:t>
+      </w:r>
+      <w:r>
+        <w:rPr>
+          <w:b/>
+          <w:bCs/>
+          <w:sz w:val="24"/>
+          <w:szCs w:val="24"/>
+        </w:rPr>
+        <w:t xml:space="preserve"> pvt ltd</w:t>
       </w:r>
       <w:r>
         <w:rPr>
@@ -1052,7 +1105,15 @@
         <w:spacing w:after="40"/>
       </w:pPr>
       <w:r>
-        <w:t>CNC Programming Training (G-Code/M-Code), NTTF (Nettur Technical Training Foundation), Bangalore</w:t>
+        <w:t>CNC Programming Training (G-Code/M-Code), NTTF (</w:t>
+      </w:r>
+      <w:proofErr w:type="spellStart"/>
+      <w:r>
+        <w:t>Nettur</w:t>
+      </w:r>
+      <w:proofErr w:type="spellEnd"/>
+      <w:r>
+        <w:t xml:space="preserve"> Technical Training Foundation), Bangalore</w:t>
       </w:r>
     </w:p>
     <w:p>

</xml_diff>